<commit_message>
final lab manual uploaded, all 15 labs
</commit_message>
<xml_diff>
--- a/lab_05_1st_part_letters.docx
+++ b/lab_05_1st_part_letters.docx
@@ -2094,4 +2094,16 @@
     </a:ext>
   </a:extLst>
 </a:theme>
+</file>
+
+<file path=customXml/item1.xml><?xml version="1.0" encoding="utf-8"?>
+<b:Sources xmlns:b="http://schemas.openxmlformats.org/officeDocument/2006/bibliography" xmlns="http://schemas.openxmlformats.org/officeDocument/2006/bibliography" SelectedStyle="\APASixthEditionOfficeOnline.xsl" StyleName="APA" Version="6"/>
+</file>
+
+<file path=customXml/itemProps1.xml><?xml version="1.0" encoding="utf-8"?>
+<ds:datastoreItem xmlns:ds="http://schemas.openxmlformats.org/officeDocument/2006/customXml" ds:itemID="{7FCD4040-26F7-4F13-AEDB-D17B8CE4FE10}">
+  <ds:schemaRefs>
+    <ds:schemaRef ds:uri="http://schemas.openxmlformats.org/officeDocument/2006/bibliography"/>
+  </ds:schemaRefs>
+</ds:datastoreItem>
 </file>
</xml_diff>